<commit_message>
feat(authors): add canonical author record + fill contact info across P3/P4/P5
- manuscripts/AUTHORS.md: single source of truth with emails, ORCIDs,
  affiliations, CRediT table, and paper registry for all dissertation papers

- P3 Vietnam (APJM): corrected corresponding author → Phan Anh Tú
  (patu@ctu.edu.vn); Đỗ Thùy Hương affiliation → VLUTE
  (huongdt@vlute.edu.vn); both ORCIDs filled

- P4 Singapore (MIR): created cover letter (digital saturation paradox
  framing) and title page — author info pre-filled from canonical record

- P5 China (IJOEM): created cover letter (threshold-stability framing)
  and title page — author info pre-filled from canonical record

Author info:
  Đỗ Thùy Hương — huongdt@vlute.edu.vn — ORCID 0000-0002-7711-2487
  Phan Anh Tú   — patu@ctu.edu.vn      — ORCID 0000-0003-0667-3137

https://claude.ai/code/session_01GMFmEtt6FYiJ4MKzBNCLqb
</commit_message>
<xml_diff>
--- a/manuscripts/p3_vietnam_cover_letter.docx
+++ b/manuscripts/p3_vietnam_cover_letter.docx
@@ -292,13 +292,43 @@
         <w:t xml:space="preserve"> </w:t>
       </w:r>
       <w:r>
-        <w:t xml:space="preserve">PhD Candidate, College of Economics</w:t>
+        <w:t xml:space="preserve">PhD Candidate</w:t>
       </w:r>
       <w:r>
         <w:t xml:space="preserve"> </w:t>
       </w:r>
       <w:r>
-        <w:t xml:space="preserve">Can Tho University, Vietnam</w:t>
+        <w:t xml:space="preserve">Vĩnh Long University of Technology Education (VLUTE), Vietnam</w:t>
+      </w:r>
+      <w:r>
+        <w:t xml:space="preserve"> </w:t>
+      </w:r>
+      <w:r>
+        <w:t xml:space="preserve">Email: huongdt@vlute.edu.vn | ORCID: 0000-0002-7711-2487</w:t>
+      </w:r>
+    </w:p>
+    <w:p>
+      <w:pPr>
+        <w:pStyle w:val="BodyText"/>
+      </w:pPr>
+      <w:r>
+        <w:rPr>
+          <w:bCs/>
+          <w:b/>
+        </w:rPr>
+        <w:t xml:space="preserve">PGS.TS. Phan Anh Tú (Phan Anh Tu)</w:t>
+      </w:r>
+      <w:r>
+        <w:t xml:space="preserve"> </w:t>
+      </w:r>
+      <w:r>
+        <w:t xml:space="preserve">Associate Professor, College of Economics</w:t>
+      </w:r>
+      <w:r>
+        <w:t xml:space="preserve"> </w:t>
+      </w:r>
+      <w:r>
+        <w:t xml:space="preserve">Can Tho University (CTU), Vietnam</w:t>
       </w:r>
       <w:r>
         <w:t xml:space="preserve"> </w:t>
@@ -314,31 +344,7 @@
         <w:t xml:space="preserve"> </w:t>
       </w:r>
       <w:r>
-        <w:t xml:space="preserve">Email: [email address]</w:t>
-      </w:r>
-    </w:p>
-    <w:p>
-      <w:pPr>
-        <w:pStyle w:val="BodyText"/>
-      </w:pPr>
-      <w:r>
-        <w:rPr>
-          <w:bCs/>
-          <w:b/>
-        </w:rPr>
-        <w:t xml:space="preserve">PGS.TS. Phan Anh Tú (Phan Anh Tu)</w:t>
-      </w:r>
-      <w:r>
-        <w:t xml:space="preserve"> </w:t>
-      </w:r>
-      <w:r>
-        <w:t xml:space="preserve">Associate Professor, College of Economics</w:t>
-      </w:r>
-      <w:r>
-        <w:t xml:space="preserve"> </w:t>
-      </w:r>
-      <w:r>
-        <w:t xml:space="preserve">Can Tho University, Vietnam</w:t>
+        <w:t xml:space="preserve">Email: patu@ctu.edu.vn | ORCID: 0000-0003-0667-3137</w:t>
       </w:r>
     </w:p>
     <w:sectPr/>

</xml_diff>